<commit_message>
Update CAB documentation baseline and Git environment configuration
</commit_message>
<xml_diff>
--- a/Microservice.docx
+++ b/Microservice.docx
@@ -1444,7 +1444,7 @@
                 <w:rFonts w:ascii="Arial" w:hAnsi="Arial"/>
                 <w:sz w:val="19"/>
               </w:rPr>
-              <w:t xml:space="preserve">Fare chỉ phát sinh khi Trip Completed; mỗi Fare có một Payment hiện hành.</w:t>
+              <w:t>Fare chỉ phát sinh khi Trip Completed; Payment hiện hành ở PENDING được tạo cùng Fare, trước khi Customer chọn phương thức.</w:t>
             </w:r>
           </w:p>
         </w:tc>
@@ -3020,7 +3020,7 @@
                 <w:rFonts w:ascii="Arial" w:hAnsi="Arial"/>
                 <w:sz w:val="19"/>
               </w:rPr>
-              <w:t xml:space="preserve">Đánh giá 1–5 sao của Customer cho Driver sau Trip Completed.</w:t>
+              <w:t>Đánh giá 1–5 sao kèm nhận xét của Customer cho Driver sau Trip Completed.</w:t>
             </w:r>
           </w:p>
         </w:tc>
@@ -5438,7 +5438,7 @@
                 <w:rFonts w:ascii="Arial" w:hAnsi="Arial"/>
                 <w:sz w:val="18"/>
               </w:rPr>
-              <w:t>Chỉ Trip Completed; 1–5 sao; một lần cho mỗi Trip; không phụ thuộc Payment.</w:t>
+              <w:t>Chỉ Trip Completed; 1–5 sao và nhận xét bắt buộc; một lần cho mỗi Trip; không phụ thuộc Payment.</w:t>
             </w:r>
           </w:p>
         </w:tc>
@@ -9591,7 +9591,7 @@
                 <w:rFonts w:ascii="Arial" w:hAnsi="Arial"/>
                 <w:sz w:val="19"/>
               </w:rPr>
-              <w:t xml:space="preserve">Hồ sơ Customer, Rating 1–5 sao và điểm tổng hợp của Driver.</w:t>
+              <w:t>Hồ sơ Customer, Rating 1–5 sao kèm nhận xét và điểm tổng hợp của Driver.</w:t>
             </w:r>
           </w:p>
         </w:tc>
@@ -13185,6 +13185,121 @@
                 <w:rFonts w:ascii="Arial" w:hAnsi="Arial"/>
                 <w:sz w:val="18"/>
               </w:rPr>
+              <w:t>Rating.comment</w:t>
+            </w:r>
+          </w:p>
+        </w:tc>
+        <w:tc>
+          <w:tcPr>
+            <w:tcW w:type="dxa" w:w="1661"/>
+            <w:shd w:val="clear" w:color="auto" w:fill="FFFFFF"/>
+            <w:tcMar>
+              <w:top w:w="80" w:type="dxa"/>
+              <w:bottom w:w="80" w:type="dxa"/>
+              <w:left w:w="100" w:type="dxa"/>
+              <w:right w:w="100" w:type="dxa"/>
+            </w:tcMar>
+            <w:vAlign w:val="center"/>
+          </w:tcPr>
+          <w:p>
+            <w:r>
+              <w:rPr>
+                <w:rFonts w:ascii="Arial" w:hAnsi="Arial"/>
+                <w:sz w:val="18"/>
+              </w:rPr>
+              <w:t>TEXT</w:t>
+            </w:r>
+          </w:p>
+        </w:tc>
+        <w:tc>
+          <w:tcPr>
+            <w:tcW w:type="dxa" w:w="1661"/>
+            <w:shd w:val="clear" w:color="auto" w:fill="FFFFFF"/>
+            <w:tcMar>
+              <w:top w:w="80" w:type="dxa"/>
+              <w:bottom w:w="80" w:type="dxa"/>
+              <w:left w:w="100" w:type="dxa"/>
+              <w:right w:w="100" w:type="dxa"/>
+            </w:tcMar>
+            <w:vAlign w:val="center"/>
+          </w:tcPr>
+          <w:p>
+            <w:r>
+              <w:rPr>
+                <w:rFonts w:ascii="Arial" w:hAnsi="Arial"/>
+                <w:sz w:val="18"/>
+              </w:rPr>
+              <w:t>Not Null</w:t>
+            </w:r>
+          </w:p>
+        </w:tc>
+        <w:tc>
+          <w:tcPr>
+            <w:tcW w:type="dxa" w:w="1661"/>
+            <w:shd w:val="clear" w:color="auto" w:fill="FFFFFF"/>
+            <w:tcMar>
+              <w:top w:w="80" w:type="dxa"/>
+              <w:bottom w:w="80" w:type="dxa"/>
+              <w:left w:w="100" w:type="dxa"/>
+              <w:right w:w="100" w:type="dxa"/>
+            </w:tcMar>
+            <w:vAlign w:val="center"/>
+          </w:tcPr>
+          <w:p>
+            <w:r>
+              <w:rPr>
+                <w:rFonts w:ascii="Arial" w:hAnsi="Arial"/>
+                <w:sz w:val="18"/>
+              </w:rPr>
+              <w:t>None</w:t>
+            </w:r>
+          </w:p>
+        </w:tc>
+        <w:tc>
+          <w:tcPr>
+            <w:tcW w:type="dxa" w:w="1661"/>
+            <w:shd w:val="clear" w:color="auto" w:fill="FFFFFF"/>
+            <w:tcMar>
+              <w:top w:w="80" w:type="dxa"/>
+              <w:bottom w:w="80" w:type="dxa"/>
+              <w:left w:w="100" w:type="dxa"/>
+              <w:right w:w="100" w:type="dxa"/>
+            </w:tcMar>
+            <w:vAlign w:val="center"/>
+          </w:tcPr>
+          <w:p>
+            <w:r>
+              <w:rPr>
+                <w:rFonts w:ascii="Arial" w:hAnsi="Arial"/>
+                <w:sz w:val="18"/>
+              </w:rPr>
+              <w:t>Nhận xét bắt buộc của Customer.</w:t>
+            </w:r>
+          </w:p>
+        </w:tc>
+      </w:tr>
+      <w:tr>
+        <w:trPr>
+          <w:cantSplit/>
+        </w:trPr>
+        <w:tc>
+          <w:tcPr>
+            <w:tcW w:type="dxa" w:w="1661"/>
+            <w:shd w:val="clear" w:color="auto" w:fill="FFFFFF"/>
+            <w:tcMar>
+              <w:top w:w="80" w:type="dxa"/>
+              <w:bottom w:w="80" w:type="dxa"/>
+              <w:left w:w="100" w:type="dxa"/>
+              <w:right w:w="100" w:type="dxa"/>
+            </w:tcMar>
+            <w:vAlign w:val="center"/>
+          </w:tcPr>
+          <w:p>
+            <w:r>
+              <w:rPr>
+                <w:rFonts w:ascii="Arial" w:hAnsi="Arial"/>
+                <w:sz w:val="18"/>
+              </w:rPr>
               <w:t xml:space="preserve">DriverRatingSummary.driver_id</w:t>
             </w:r>
           </w:p>
@@ -19854,7 +19969,7 @@
                 <w:rFonts w:ascii="Arial" w:hAnsi="Arial"/>
                 <w:sz w:val="18"/>
               </w:rPr>
-              <w:t xml:space="preserve">Cash / Electronic</w:t>
+              <w:t>Null trước chọn; Cash / Electronic sau chọn</w:t>
             </w:r>
           </w:p>
         </w:tc>
@@ -19898,7 +20013,7 @@
                 <w:rFonts w:ascii="Arial" w:hAnsi="Arial"/>
                 <w:sz w:val="18"/>
               </w:rPr>
-              <w:t xml:space="preserve">Phương thức thanh toán.</w:t>
+              <w:t>Phương thức được chọn sau khi Payment PENDING được tạo cùng Fare.</w:t>
             </w:r>
           </w:p>
         </w:tc>

</xml_diff>

<commit_message>
Implement CAB microservices and grading workflows
</commit_message>
<xml_diff>
--- a/Microservice.docx
+++ b/Microservice.docx
@@ -4369,7 +4369,7 @@
           <w:color w:val="262626"/>
           <w:sz w:val="19"/>
         </w:rPr>
-        <w:t xml:space="preserve">• Customer, Driver &amp; Vehicle và Location: </w:t>
+        <w:t xml:space="preserve">• Driver &amp; Vehicle và Location: </w:t>
       </w:r>
       <w:r>
         <w:rPr>
@@ -5771,7 +5771,7 @@
                 <w:rFonts w:ascii="Arial" w:hAnsi="Arial"/>
                 <w:sz w:val="19"/>
               </w:rPr>
-              <w:t xml:space="preserve">Searching → Driver Assigned → Trip Created → Completed / Cancelled / No Driver Available</w:t>
+              <w:t xml:space="preserve">Searching → Driver Assigned → Trip Created → Completed / Canceled / No Driver Available</w:t>
             </w:r>
           </w:p>
         </w:tc>
@@ -5984,7 +5984,7 @@
                 <w:rFonts w:ascii="Arial" w:hAnsi="Arial"/>
                 <w:sz w:val="19"/>
               </w:rPr>
-              <w:t xml:space="preserve">Pending → Paid / Failed; Failed → Pending khi Customer thực hiện lại</w:t>
+              <w:t xml:space="preserve">Pending → COMPLETED / Failed; Failed → Pending khi Customer thực hiện lại</w:t>
             </w:r>
           </w:p>
         </w:tc>
@@ -7689,7 +7689,7 @@
                 <w:rFonts w:ascii="Arial" w:hAnsi="Arial"/>
                 <w:sz w:val="18"/>
               </w:rPr>
-              <w:t xml:space="preserve">Thông báo và cập nhật doanh thu khi Paid.</w:t>
+              <w:t xml:space="preserve">Thông báo và cập nhật doanh thu khi COMPLETED.</w:t>
             </w:r>
           </w:p>
         </w:tc>
@@ -8406,7 +8406,7 @@
                 <w:rFonts w:ascii="Arial" w:hAnsi="Arial"/>
                 <w:sz w:val="19"/>
               </w:rPr>
-              <w:t xml:space="preserve">REST/gRPC; customer and rating events</w:t>
+              <w:t xml:space="preserve">REST qua Gateway; customer and rating events</w:t>
             </w:r>
           </w:p>
         </w:tc>
@@ -20084,7 +20084,7 @@
                 <w:rFonts w:ascii="Arial" w:hAnsi="Arial"/>
                 <w:sz w:val="18"/>
               </w:rPr>
-              <w:t xml:space="preserve">Pending / Paid / Failed</w:t>
+              <w:t xml:space="preserve">Pending / COMPLETED / Failed</w:t>
             </w:r>
           </w:p>
         </w:tc>
@@ -22709,7 +22709,7 @@
                 <w:rFonts w:ascii="Arial" w:hAnsi="Arial"/>
                 <w:sz w:val="18"/>
               </w:rPr>
-              <w:t xml:space="preserve">Doanh thu Payment đã Paid.</w:t>
+              <w:t xml:space="preserve">Doanh thu Payment đã COMPLETED.</w:t>
             </w:r>
           </w:p>
         </w:tc>

</xml_diff>